<commit_message>
docs(knowledge): AIAS+ paper states the 11 evaluated corpora hold 48,214 passages
Summed from each corpus's build log (`Chunks to process:`), which matches
its chunk store. WarPeace, the twelfth corpus, has no rebuild log, so it
is left out of the total. The figure is added to the evidence ledger.

Co-Authored-By: Claude Opus 5.5 <noreply@anthropic.com>
Claude-Session: https://claude.ai/code/session_01MkfPYGA2qfgwmiUBXSd5Zh
</commit_message>
<xml_diff>
--- a/projects/kwaai-knowledge/papers/aias2026/submission54-4page.docx
+++ b/projects/kwaai-knowledge/papers/aias2026/submission54-4page.docx
@@ -533,13 +533,13 @@
         <w:t xml:space="preserve"> </w:t>
       </w:r>
       <w:r>
-        <w:t xml:space="preserve">five cycles. Eleven of them have 20 questions each with gold keywords; answer recall is the fraction</w:t>
-      </w:r>
-      <w:r>
-        <w:t xml:space="preserve"> </w:t>
-      </w:r>
-      <w:r>
-        <w:t xml:space="preserve">of gold keywords that appear in the generated answer.</w:t>
+        <w:t xml:space="preserve">five cycles. Eleven of them (48,214 passages in all) have 20 questions each with gold keywords; answer</w:t>
+      </w:r>
+      <w:r>
+        <w:t xml:space="preserve"> </w:t>
+      </w:r>
+      <w:r>
+        <w:t xml:space="preserve">recall is the fraction of gold keywords that appear in the generated answer.</w:t>
       </w:r>
     </w:p>
     <w:bookmarkEnd w:id="31"/>

</xml_diff>